<commit_message>
add wandb config to config file
</commit_message>
<xml_diff>
--- a/experiments/12-30.docx
+++ b/experiments/12-30.docx
@@ -3,14 +3,42 @@
 <w:document xmlns:wpc="http://schemas.microsoft.com/office/word/2010/wordprocessingCanvas" xmlns:cx="http://schemas.microsoft.com/office/drawing/2014/chartex" xmlns:cx1="http://schemas.microsoft.com/office/drawing/2015/9/8/chartex" xmlns:cx2="http://schemas.microsoft.com/office/drawing/2015/10/21/chartex" xmlns:cx3="http://schemas.microsoft.com/office/drawing/2016/5/9/chartex" xmlns:cx4="http://schemas.microsoft.com/office/drawing/2016/5/10/chartex" xmlns:cx5="http://schemas.microsoft.com/office/drawing/2016/5/11/chartex" xmlns:cx6="http://schemas.microsoft.com/office/drawing/2016/5/12/chartex" xmlns:cx7="http://schemas.microsoft.com/office/drawing/2016/5/13/chartex" xmlns:cx8="http://schemas.microsoft.com/office/drawing/2016/5/14/chartex" xmlns:mc="http://schemas.openxmlformats.org/markup-compatibility/2006" xmlns:aink="http://schemas.microsoft.com/office/drawing/2016/ink" xmlns:am3d="http://schemas.microsoft.com/office/drawing/2017/model3d" xmlns:o="urn:schemas-microsoft-com:office:office" xmlns:oel="http://schemas.microsoft.com/office/2019/extlst" xmlns:r="http://schemas.openxmlformats.org/officeDocument/2006/relationships" xmlns:m="http://schemas.openxmlformats.org/officeDocument/2006/math" xmlns:v="urn:schemas-microsoft-com:vml" xmlns:wp14="http://schemas.microsoft.com/office/word/2010/wordprocessingDrawing" xmlns:wp="http://schemas.openxmlformats.org/drawingml/2006/wordprocessingDrawing" xmlns:w10="urn:schemas-microsoft-com:office:word" xmlns:w="http://schemas.openxmlformats.org/wordprocessingml/2006/main" xmlns:w14="http://schemas.microsoft.com/office/word/2010/wordml" xmlns:w15="http://schemas.microsoft.com/office/word/2012/wordml" xmlns:w16cex="http://schemas.microsoft.com/office/word/2018/wordml/cex" xmlns:w16cid="http://schemas.microsoft.com/office/word/2016/wordml/cid" xmlns:w16="http://schemas.microsoft.com/office/word/2018/wordml" xmlns:w16du="http://schemas.microsoft.com/office/word/2023/wordml/word16du" xmlns:w16sdtdh="http://schemas.microsoft.com/office/word/2020/wordml/sdtdatahash" xmlns:w16sdtfl="http://schemas.microsoft.com/office/word/2024/wordml/sdtformatlock" xmlns:w16se="http://schemas.microsoft.com/office/word/2015/wordml/symex" xmlns:wpg="http://schemas.microsoft.com/office/word/2010/wordprocessingGroup" xmlns:wpi="http://schemas.microsoft.com/office/word/2010/wordprocessingInk" xmlns:wne="http://schemas.microsoft.com/office/word/2006/wordml" xmlns:wps="http://schemas.microsoft.com/office/word/2010/wordprocessingShape" mc:Ignorable="w14 w15 w16se w16cid w16 w16cex w16sdtdh w16sdtfl w16du wp14">
   <w:body>
     <w:p>
-      <w:r>
-        <w:rPr>
-          <w:rFonts w:hint="eastAsia"/>
-        </w:rPr>
-        <w:t>实验ddp：</w:t>
-      </w:r>
-    </w:p>
-    <w:p>
+      <w:pPr>
+        <w:rPr>
+          <w:rFonts w:hint="eastAsia"/>
+        </w:rPr>
+      </w:pPr>
+      <w:r>
+        <w:rPr>
+          <w:rFonts w:hint="eastAsia"/>
+          <w:b/>
+          <w:bCs/>
+        </w:rPr>
+        <w:t>实验</w:t>
+      </w:r>
+      <w:proofErr w:type="spellStart"/>
+      <w:r>
+        <w:rPr>
+          <w:rFonts w:hint="eastAsia"/>
+          <w:b/>
+          <w:bCs/>
+        </w:rPr>
+        <w:t>ddp</w:t>
+      </w:r>
+      <w:proofErr w:type="spellEnd"/>
+      <w:r>
+        <w:rPr>
+          <w:rFonts w:hint="eastAsia"/>
+        </w:rPr>
+        <w:t>：</w:t>
+      </w:r>
+    </w:p>
+    <w:p>
+      <w:pPr>
+        <w:rPr>
+          <w:rFonts w:hint="eastAsia"/>
+        </w:rPr>
+      </w:pPr>
       <w:r>
         <w:rPr>
           <w:rFonts w:hint="eastAsia"/>
@@ -26,85 +54,662 @@
       </w:pPr>
     </w:p>
     <w:p>
-      <w:r>
-        <w:rPr>
-          <w:rFonts w:hint="eastAsia"/>
-        </w:rPr>
-        <w:t>实验jit：</w:t>
-      </w:r>
-    </w:p>
-    <w:p>
-      <w:r>
-        <w:rPr>
-          <w:rFonts w:hint="eastAsia"/>
-        </w:rPr>
-        <w:t>实验compile train_step: 失败,</w:t>
-      </w:r>
-      <w:r>
-        <w:rPr>
-          <w:rFonts w:hint="eastAsia"/>
+      <w:pPr>
+        <w:rPr>
+          <w:rFonts w:hint="eastAsia"/>
+        </w:rPr>
+      </w:pPr>
+      <w:r>
+        <w:rPr>
+          <w:rFonts w:hint="eastAsia"/>
+          <w:b/>
+          <w:bCs/>
+        </w:rPr>
+        <w:t>实验</w:t>
+      </w:r>
+      <w:proofErr w:type="spellStart"/>
+      <w:r>
+        <w:rPr>
+          <w:rFonts w:hint="eastAsia"/>
+          <w:b/>
+          <w:bCs/>
+        </w:rPr>
+        <w:t>jit</w:t>
+      </w:r>
+      <w:proofErr w:type="spellEnd"/>
+      <w:r>
+        <w:rPr>
+          <w:rFonts w:hint="eastAsia"/>
+        </w:rPr>
+        <w:t>：</w:t>
+      </w:r>
+    </w:p>
+    <w:p>
+      <w:pPr>
+        <w:rPr>
+          <w:rFonts w:hint="eastAsia"/>
+        </w:rPr>
+      </w:pPr>
+      <w:r>
+        <w:rPr>
+          <w:rFonts w:hint="eastAsia"/>
+          <w:u w:val="single"/>
+        </w:rPr>
+        <w:t xml:space="preserve">实验compile </w:t>
+      </w:r>
+      <w:proofErr w:type="spellStart"/>
+      <w:r>
+        <w:rPr>
+          <w:rFonts w:hint="eastAsia"/>
+          <w:u w:val="single"/>
+        </w:rPr>
+        <w:t>train_step</w:t>
+      </w:r>
+      <w:proofErr w:type="spellEnd"/>
+      <w:r>
+        <w:rPr>
+          <w:rFonts w:hint="eastAsia"/>
+        </w:rPr>
+        <w:t>: 失败,</w:t>
+      </w:r>
+      <w:r>
+        <w:rPr>
+          <w:rFonts w:hint="eastAsia"/>
+        </w:rPr>
+        <w:t xml:space="preserve"> compilation error on the optimizer</w:t>
+      </w:r>
+    </w:p>
+    <w:p>
+      <w:pPr>
+        <w:rPr>
+          <w:rFonts w:hint="eastAsia"/>
+        </w:rPr>
+      </w:pPr>
+      <w:r>
+        <w:rPr>
+          <w:rFonts w:hint="eastAsia"/>
+          <w:u w:val="single"/>
+        </w:rPr>
+        <w:t>实验compile model</w:t>
+      </w:r>
+      <w:r>
+        <w:rPr>
+          <w:rFonts w:hint="eastAsia"/>
+        </w:rPr>
+        <w:t>：有提速结果-&gt;</w:t>
+      </w:r>
+    </w:p>
+    <w:p>
+      <w:pPr>
+        <w:rPr>
+          <w:rFonts w:hint="eastAsia"/>
+        </w:rPr>
+      </w:pPr>
+      <w:r>
+        <w:rPr>
+          <w:rFonts w:hint="eastAsia"/>
+        </w:rPr>
+        <w:t>模型越大</w:t>
+      </w:r>
+      <w:r>
+        <w:rPr>
+          <w:rFonts w:hint="eastAsia"/>
+        </w:rPr>
+        <w:t>：speed up</w:t>
+      </w:r>
+      <w:r>
+        <w:rPr>
+          <w:rFonts w:hint="eastAsia"/>
+        </w:rPr>
+        <w:t>越小</w:t>
+      </w:r>
+    </w:p>
+    <w:p>
+      <w:pPr>
+        <w:rPr>
+          <w:rFonts w:hint="eastAsia"/>
+        </w:rPr>
+      </w:pPr>
+      <w:r>
+        <w:rPr>
+          <w:rFonts w:hint="eastAsia"/>
+        </w:rPr>
+        <w:t>数据</w:t>
+      </w:r>
+      <w:r>
+        <w:rPr>
+          <w:rFonts w:hint="eastAsia"/>
+        </w:rPr>
+        <w:t>（batch size）</w:t>
+      </w:r>
+      <w:r>
+        <w:rPr>
+          <w:rFonts w:hint="eastAsia"/>
+        </w:rPr>
+        <w:t>越大：speed up越大</w:t>
+      </w:r>
+    </w:p>
+    <w:p>
+      <w:pPr>
+        <w:rPr>
+          <w:rFonts w:hint="eastAsia"/>
+          <w:u w:val="single"/>
+        </w:rPr>
+      </w:pPr>
+      <w:r>
+        <w:rPr>
+          <w:rFonts w:hint="eastAsia"/>
+          <w:u w:val="single"/>
+        </w:rPr>
+        <w:t xml:space="preserve">可实验compile </w:t>
+      </w:r>
+      <w:proofErr w:type="spellStart"/>
+      <w:r>
+        <w:rPr>
+          <w:rFonts w:hint="eastAsia"/>
+          <w:u w:val="single"/>
+        </w:rPr>
+        <w:t>train_epoch</w:t>
+      </w:r>
+      <w:proofErr w:type="spellEnd"/>
+      <w:r>
+        <w:rPr>
+          <w:rFonts w:hint="eastAsia"/>
+          <w:u w:val="single"/>
+        </w:rPr>
+        <w:t>, inference等</w:t>
+      </w:r>
+    </w:p>
+    <w:p>
+      <w:pPr>
+        <w:rPr>
+          <w:rFonts w:hint="eastAsia"/>
+          <w:u w:val="single"/>
+        </w:rPr>
+      </w:pPr>
+    </w:p>
+    <w:p>
+      <w:pPr>
+        <w:rPr>
+          <w:rFonts w:hint="eastAsia"/>
+          <w:b/>
+          <w:bCs/>
+        </w:rPr>
+      </w:pPr>
+      <w:bookmarkStart w:id="0" w:name="_Hlk218031581"/>
+      <w:r>
+        <w:rPr>
+          <w:rFonts w:hint="eastAsia"/>
+          <w:b/>
+          <w:bCs/>
+        </w:rPr>
+        <w:t>代码加入</w:t>
+      </w:r>
+      <w:proofErr w:type="spellStart"/>
+      <w:r>
+        <w:rPr>
+          <w:rFonts w:hint="eastAsia"/>
+          <w:b/>
+          <w:bCs/>
+        </w:rPr>
+        <w:t>jit</w:t>
+      </w:r>
+      <w:proofErr w:type="spellEnd"/>
+      <w:r>
+        <w:rPr>
+          <w:rFonts w:hint="eastAsia"/>
+          <w:b/>
+          <w:bCs/>
+        </w:rPr>
+        <w:t>：</w:t>
+      </w:r>
+    </w:p>
+    <w:p>
+      <w:pPr>
+        <w:rPr>
+          <w:rFonts w:hint="eastAsia"/>
+        </w:rPr>
+      </w:pPr>
+      <w:r>
+        <w:rPr>
+          <w:rFonts w:hint="eastAsia"/>
+        </w:rPr>
+        <w:t xml:space="preserve">发现时间反而增加-&gt; </w:t>
+      </w:r>
+    </w:p>
+    <w:p>
+      <w:pPr>
+        <w:rPr>
+          <w:rFonts w:hint="eastAsia"/>
+        </w:rPr>
+      </w:pPr>
+      <w:r>
+        <w:rPr>
+          <w:rFonts w:hint="eastAsia"/>
+          <w:u w:val="single"/>
+        </w:rPr>
+        <w:t>可能</w:t>
+      </w:r>
+      <w:r>
+        <w:rPr>
+          <w:rFonts w:hint="eastAsia"/>
+          <w:u w:val="single"/>
+        </w:rPr>
+        <w:t>原因1</w:t>
+      </w:r>
+      <w:r>
+        <w:rPr>
+          <w:rFonts w:hint="eastAsia"/>
+        </w:rPr>
+        <w:t>：</w:t>
+      </w:r>
+      <w:r>
+        <w:rPr>
+          <w:rFonts w:hint="eastAsia"/>
+        </w:rPr>
+        <w:t>batch size减小（64-&gt;48，可能由于compiled model消耗额外</w:t>
+      </w:r>
+      <w:proofErr w:type="spellStart"/>
+      <w:r>
+        <w:rPr>
+          <w:rFonts w:hint="eastAsia"/>
+        </w:rPr>
+        <w:t>gpu</w:t>
+      </w:r>
+      <w:proofErr w:type="spellEnd"/>
+      <w:r>
+        <w:rPr>
+          <w:rFonts w:hint="eastAsia"/>
+        </w:rPr>
+        <w:t xml:space="preserve"> memory）导致提速效果变差</w:t>
+      </w:r>
+    </w:p>
+    <w:p>
+      <w:pPr>
+        <w:rPr>
+          <w:rFonts w:hint="eastAsia"/>
+        </w:rPr>
+      </w:pPr>
+      <w:r>
+        <w:rPr>
+          <w:rFonts w:hint="eastAsia"/>
+          <w:u w:val="single"/>
+        </w:rPr>
+        <w:t>可能原因2</w:t>
+      </w:r>
+      <w:r>
+        <w:rPr>
+          <w:rFonts w:hint="eastAsia"/>
+        </w:rPr>
+        <w:t>：实验</w:t>
+      </w:r>
+      <w:proofErr w:type="spellStart"/>
+      <w:r>
+        <w:rPr>
+          <w:rFonts w:hint="eastAsia"/>
+        </w:rPr>
+        <w:t>jit</w:t>
+      </w:r>
+      <w:proofErr w:type="spellEnd"/>
+      <w:r>
+        <w:rPr>
+          <w:rFonts w:hint="eastAsia"/>
+        </w:rPr>
+        <w:t>使用的pure benchmark：</w:t>
+      </w:r>
+      <w:r>
+        <w:rPr>
+          <w:rFonts w:ascii="黑体" w:eastAsia="黑体" w:hAnsi="黑体" w:hint="eastAsia"/>
+        </w:rPr>
+        <w:t xml:space="preserve">_, </w:t>
+      </w:r>
+      <w:proofErr w:type="spellStart"/>
+      <w:r>
+        <w:rPr>
+          <w:rFonts w:ascii="黑体" w:eastAsia="黑体" w:hAnsi="黑体" w:hint="eastAsia"/>
+        </w:rPr>
+        <w:t>compile_time</w:t>
+      </w:r>
+      <w:proofErr w:type="spellEnd"/>
+      <w:r>
+        <w:rPr>
+          <w:rFonts w:ascii="黑体" w:eastAsia="黑体" w:hAnsi="黑体" w:hint="eastAsia"/>
+        </w:rPr>
+        <w:t xml:space="preserve"> = timed(lambda: </w:t>
+      </w:r>
+      <w:proofErr w:type="spellStart"/>
+      <w:r>
+        <w:rPr>
+          <w:rFonts w:ascii="黑体" w:eastAsia="黑体" w:hAnsi="黑体" w:hint="eastAsia"/>
+        </w:rPr>
+        <w:t>train_step</w:t>
+      </w:r>
+      <w:proofErr w:type="spellEnd"/>
+      <w:r>
+        <w:rPr>
+          <w:rFonts w:ascii="黑体" w:eastAsia="黑体" w:hAnsi="黑体" w:hint="eastAsia"/>
+        </w:rPr>
+        <w:t>(inputs, targets, step))</w:t>
+      </w:r>
+      <w:r>
+        <w:rPr>
+          <w:rFonts w:hint="eastAsia"/>
+        </w:rPr>
+        <w:t>，没有加入data转移时间：i</w:t>
+      </w:r>
+      <w:r>
+        <w:rPr>
+          <w:rFonts w:ascii="黑体" w:eastAsia="黑体" w:hAnsi="黑体" w:hint="eastAsia"/>
+        </w:rPr>
+        <w:t>nputs = inputs.to(device)</w:t>
+      </w:r>
+      <w:r>
+        <w:rPr>
+          <w:rFonts w:ascii="黑体" w:eastAsia="黑体" w:hAnsi="黑体" w:hint="eastAsia"/>
         </w:rPr>
         <w:t xml:space="preserve"> </w:t>
       </w:r>
       <w:r>
         <w:rPr>
-          <w:rFonts w:hint="eastAsia"/>
-        </w:rPr>
-        <w:t>compilation error on the optimizer</w:t>
-      </w:r>
-    </w:p>
-    <w:p>
-      <w:pPr>
-        <w:rPr>
-          <w:rFonts w:hint="eastAsia"/>
-        </w:rPr>
-      </w:pPr>
-      <w:r>
-        <w:rPr>
-          <w:rFonts w:hint="eastAsia"/>
-        </w:rPr>
-        <w:t>实验compile model：有提速结果-&gt;</w:t>
-      </w:r>
-    </w:p>
-    <w:p>
-      <w:r>
-        <w:rPr>
-          <w:rFonts w:hint="eastAsia"/>
-        </w:rPr>
-        <w:t>模型越大</w:t>
-      </w:r>
-      <w:r>
-        <w:rPr>
-          <w:rFonts w:hint="eastAsia"/>
-        </w:rPr>
-        <w:t>：speed up</w:t>
-      </w:r>
-      <w:r>
-        <w:rPr>
-          <w:rFonts w:hint="eastAsia"/>
-        </w:rPr>
-        <w:t>越小</w:t>
-      </w:r>
-    </w:p>
-    <w:p>
-      <w:r>
-        <w:rPr>
-          <w:rFonts w:hint="eastAsia"/>
-        </w:rPr>
-        <w:t>数据越大：speed up越大</w:t>
-      </w:r>
-    </w:p>
-    <w:p>
-      <w:pPr>
-        <w:rPr>
-          <w:rFonts w:hint="eastAsia"/>
-        </w:rPr>
-      </w:pPr>
-      <w:r>
-        <w:rPr>
-          <w:rFonts w:hint="eastAsia"/>
-        </w:rPr>
-        <w:t>可实验compile train_epoch, inference等</w:t>
+          <w:rFonts w:ascii="黑体" w:eastAsia="黑体" w:hAnsi="黑体" w:hint="eastAsia"/>
+        </w:rPr>
+        <w:t xml:space="preserve"> targets = targets.to(device)</w:t>
+      </w:r>
+      <w:r>
+        <w:rPr>
+          <w:rFonts w:hint="eastAsia"/>
+        </w:rPr>
+        <w:t>。</w:t>
+      </w:r>
+      <w:r>
+        <w:rPr>
+          <w:rFonts w:hint="eastAsia"/>
+        </w:rPr>
+        <w:t>如果加入data转移时间，可能会进一步冲淡compile的优化效果</w:t>
+      </w:r>
+    </w:p>
+    <w:p>
+      <w:pPr>
+        <w:rPr>
+          <w:rFonts w:hint="eastAsia"/>
+        </w:rPr>
+      </w:pPr>
+    </w:p>
+    <w:p>
+      <w:pPr>
+        <w:rPr>
+          <w:rFonts w:hint="eastAsia"/>
+        </w:rPr>
+      </w:pPr>
+      <w:r>
+        <w:rPr>
+          <w:rFonts w:hint="eastAsia"/>
+          <w:u w:val="single"/>
+        </w:rPr>
+        <w:t>新实验：</w:t>
+      </w:r>
+      <w:r>
+        <w:rPr>
+          <w:rFonts w:hint="eastAsia"/>
+        </w:rPr>
+        <w:t>针对</w:t>
+      </w:r>
+      <w:r>
+        <w:rPr>
+          <w:rFonts w:hint="eastAsia"/>
+          <w:u w:val="single"/>
+        </w:rPr>
+        <w:t>可能原因2</w:t>
+      </w:r>
+      <w:r>
+        <w:rPr>
+          <w:rFonts w:hint="eastAsia"/>
+        </w:rPr>
+        <w:t>，</w:t>
+      </w:r>
+      <w:r>
+        <w:rPr>
+          <w:rFonts w:hint="eastAsia"/>
+        </w:rPr>
+        <w:t>设置</w:t>
+      </w:r>
+      <w:r>
+        <w:rPr>
+          <w:rFonts w:hint="eastAsia"/>
+        </w:rPr>
+        <w:t>batch size为48</w:t>
+      </w:r>
+      <w:r>
+        <w:rPr>
+          <w:rFonts w:hint="eastAsia"/>
+        </w:rPr>
+        <w:t>。分别使用pure benchmark和原始trainer.py的测量时间benchmark，</w:t>
+      </w:r>
+      <w:r>
+        <w:rPr>
+          <w:rFonts w:hint="eastAsia"/>
+        </w:rPr>
+        <w:t>对比compile和non-compile</w:t>
+      </w:r>
+      <w:r>
+        <w:rPr>
+          <w:rFonts w:hint="eastAsia"/>
+        </w:rPr>
+        <w:t xml:space="preserve"> speed up</w:t>
+      </w:r>
+      <w:r>
+        <w:rPr>
+          <w:rFonts w:hint="eastAsia"/>
+        </w:rPr>
+        <w:t>，</w:t>
+      </w:r>
+      <w:r>
+        <w:rPr>
+          <w:rFonts w:hint="eastAsia"/>
+        </w:rPr>
+        <w:t>结果为pure benchmark speed up: 1.26*, 原始benchmark speed up: 1.06*，结果表明可能原因2成立</w:t>
+      </w:r>
+      <w:r>
+        <w:rPr>
+          <w:rFonts w:hint="eastAsia"/>
+        </w:rPr>
+        <w:t>。</w:t>
+      </w:r>
+    </w:p>
+    <w:p>
+      <w:pPr>
+        <w:rPr>
+          <w:rFonts w:hint="eastAsia"/>
+        </w:rPr>
+      </w:pPr>
+    </w:p>
+    <w:p>
+      <w:pPr>
+        <w:rPr>
+          <w:strike/>
+        </w:rPr>
+      </w:pPr>
+      <w:r>
+        <w:rPr>
+          <w:rFonts w:hint="eastAsia"/>
+          <w:strike/>
+          <w:u w:val="single"/>
+        </w:rPr>
+        <w:t>最终结论：</w:t>
+      </w:r>
+      <w:r>
+        <w:rPr>
+          <w:rFonts w:hint="eastAsia"/>
+          <w:strike/>
+        </w:rPr>
+        <w:t>虽然使用</w:t>
+      </w:r>
+      <w:proofErr w:type="spellStart"/>
+      <w:r>
+        <w:rPr>
+          <w:rFonts w:hint="eastAsia"/>
+          <w:strike/>
+        </w:rPr>
+        <w:t>torch.compile</w:t>
+      </w:r>
+      <w:proofErr w:type="spellEnd"/>
+      <w:r>
+        <w:rPr>
+          <w:rFonts w:hint="eastAsia"/>
+          <w:strike/>
+        </w:rPr>
+        <w:t>可以提升</w:t>
+      </w:r>
+      <w:proofErr w:type="spellStart"/>
+      <w:r>
+        <w:rPr>
+          <w:rFonts w:hint="eastAsia"/>
+          <w:strike/>
+        </w:rPr>
+        <w:t>train_step</w:t>
+      </w:r>
+      <w:proofErr w:type="spellEnd"/>
+      <w:r>
+        <w:rPr>
+          <w:rFonts w:hint="eastAsia"/>
+          <w:strike/>
+        </w:rPr>
+        <w:t>的效率，但是考虑到引入</w:t>
+      </w:r>
+      <w:proofErr w:type="spellStart"/>
+      <w:r>
+        <w:rPr>
+          <w:rFonts w:hint="eastAsia"/>
+          <w:strike/>
+        </w:rPr>
+        <w:t>torch.compile</w:t>
+      </w:r>
+      <w:proofErr w:type="spellEnd"/>
+      <w:r>
+        <w:rPr>
+          <w:rFonts w:hint="eastAsia"/>
+          <w:strike/>
+        </w:rPr>
+        <w:t>将导致batch size减小，会使speed up效果削弱，加上data转移时间进一步冲淡speed up效果，最终会导致总时间反而增加，所以可以考虑不适用compile。</w:t>
+      </w:r>
+    </w:p>
+    <w:p>
+      <w:pPr>
+        <w:rPr>
+          <w:strike/>
+        </w:rPr>
+      </w:pPr>
+    </w:p>
+    <w:p>
+      <w:pPr>
+        <w:rPr>
+          <w:rFonts w:hint="eastAsia"/>
+        </w:rPr>
+      </w:pPr>
+      <w:r>
+        <w:rPr>
+          <w:rFonts w:hint="eastAsia"/>
+          <w:u w:val="single"/>
+        </w:rPr>
+        <w:t>12-31补充实验：</w:t>
+      </w:r>
+      <w:r>
+        <w:rPr>
+          <w:rFonts w:hint="eastAsia"/>
+        </w:rPr>
+        <w:t>经检查，发现真实问题为config文件model size设置错误(过大)导致训练时间变长，更正config文件并重新使用</w:t>
+      </w:r>
+      <w:proofErr w:type="spellStart"/>
+      <w:r>
+        <w:rPr>
+          <w:rFonts w:hint="eastAsia"/>
+        </w:rPr>
+        <w:t>jit</w:t>
+      </w:r>
+      <w:proofErr w:type="spellEnd"/>
+      <w:r>
+        <w:rPr>
+          <w:rFonts w:hint="eastAsia"/>
+        </w:rPr>
+        <w:t>后，最终结果表明，</w:t>
+      </w:r>
+      <w:proofErr w:type="spellStart"/>
+      <w:r>
+        <w:rPr>
+          <w:rFonts w:hint="eastAsia"/>
+          <w:color w:val="92D050"/>
+        </w:rPr>
+        <w:t>jit</w:t>
+      </w:r>
+      <w:proofErr w:type="spellEnd"/>
+      <w:r>
+        <w:rPr>
+          <w:rFonts w:hint="eastAsia"/>
+          <w:color w:val="92D050"/>
+        </w:rPr>
+        <w:t>可以实现加速</w:t>
+      </w:r>
+      <w:r>
+        <w:rPr>
+          <w:rFonts w:hint="eastAsia"/>
+        </w:rPr>
+        <w:t>。</w:t>
+      </w:r>
+    </w:p>
+    <w:bookmarkEnd w:id="0"/>
+    <w:p>
+      <w:pPr>
+        <w:rPr>
+          <w:rFonts w:hint="eastAsia"/>
+        </w:rPr>
+      </w:pPr>
+    </w:p>
+    <w:p>
+      <w:pPr>
+        <w:rPr>
+          <w:rFonts w:hint="eastAsia"/>
+          <w:b/>
+          <w:bCs/>
+        </w:rPr>
+      </w:pPr>
+      <w:r>
+        <w:rPr>
+          <w:rFonts w:hint="eastAsia"/>
+          <w:b/>
+          <w:bCs/>
+        </w:rPr>
+        <w:t>重构代码</w:t>
+      </w:r>
+    </w:p>
+    <w:p>
+      <w:pPr>
+        <w:rPr>
+          <w:rFonts w:hint="eastAsia"/>
+        </w:rPr>
+      </w:pPr>
+      <w:r>
+        <w:rPr>
+          <w:rFonts w:hint="eastAsia"/>
+        </w:rPr>
+        <w:t>使用</w:t>
+      </w:r>
+      <w:r>
+        <w:rPr>
+          <w:rFonts w:hint="eastAsia"/>
+        </w:rPr>
+        <w:t>config</w:t>
+      </w:r>
+      <w:r>
+        <w:rPr>
+          <w:rFonts w:hint="eastAsia"/>
+        </w:rPr>
+        <w:t>文件</w:t>
+      </w:r>
+      <w:r>
+        <w:rPr>
+          <w:rFonts w:hint="eastAsia"/>
+        </w:rPr>
+        <w:t>，封装函数等</w:t>
       </w:r>
     </w:p>
     <w:sectPr>

</xml_diff>